<commit_message>
Atualiza os documentos: login entregue desativado
</commit_message>
<xml_diff>
--- a/docs/atualizados/HoverVoice-Documentacao-do-Software.docx
+++ b/docs/atualizados/HoverVoice-Documentacao-do-Software.docx
@@ -63,7 +63,25 @@
           <w:sz w:val="22"/>
           <w:szCs w:val="22"/>
         </w:rPr>
-        <w:t xml:space="preserve">O HoverVoice é uma extensão de navegador que narra em voz alta o conteúdo de páginas web e de PDFs enquanto a pessoa passa o cursor ou navega com o teclado, para ampliar a autonomia de quem tem deficiência visual ou baixa visão. A interface e a voz funcionam em português, inglês e espanhol. Uma conta com Google, totalmente opcional, permite levar as preferências de voz para outro navegador.</w:t>
+        <w:t xml:space="preserve">O HoverVoice é uma extensão de navegador que narra em voz alta o conteúdo de páginas web e de PDFs enquanto a pessoa passa o cursor ou navega com o teclado, para ampliar a autonomia de quem tem deficiência visual ou baixa visão. A interface e a voz funcionam em português, inglês e espanhol. Uma conta com Google, totalmente opcional, permite levar as preferências de voz para outro navegador; esse recurso está pronto, mas </w:t>
+      </w:r>
+      <w:r>
+        <w:rPr>
+          <w:rFonts w:ascii="Arial" w:cs="Arial" w:eastAsia="Arial" w:hAnsi="Arial"/>
+          <w:b/>
+          <w:bCs/>
+          <w:sz w:val="22"/>
+          <w:szCs w:val="22"/>
+        </w:rPr>
+        <w:t xml:space="preserve">desativado</w:t>
+      </w:r>
+      <w:r>
+        <w:rPr>
+          <w:rFonts w:ascii="Arial" w:cs="Arial" w:eastAsia="Arial" w:hAnsi="Arial"/>
+          <w:sz w:val="22"/>
+          <w:szCs w:val="22"/>
+        </w:rPr>
+        <w:t xml:space="preserve"> até a configuração do Google Cloud (seção 9).</w:t>
       </w:r>
     </w:p>
     <w:p>
@@ -3053,7 +3071,7 @@
                 <w:sz w:val="19"/>
                 <w:szCs w:val="19"/>
               </w:rPr>
-              <w:t xml:space="preserve">Entrar ou criar conta com o Google, de forma opcional</w:t>
+              <w:t xml:space="preserve">Entrar ou criar conta com o Google, de forma opcional; sem Client ID configurado, o cartão de conta fica oculto</w:t>
             </w:r>
           </w:p>
         </w:tc>
@@ -3390,7 +3408,7 @@
                 <w:sz w:val="19"/>
                 <w:szCs w:val="19"/>
               </w:rPr>
-              <w:t xml:space="preserve">Funcionar normalmente, com preferências locais, sem login ou com o servidor indisponível</w:t>
+              <w:t xml:space="preserve">Funcionar normalmente, com preferências locais, sem login, sem Client ID configurado ou com o servidor indisponível</w:t>
             </w:r>
           </w:p>
         </w:tc>
@@ -11564,7 +11582,7 @@
                 <w:sz w:val="19"/>
                 <w:szCs w:val="19"/>
               </w:rPr>
-              <w:t xml:space="preserve">Login não funciona</w:t>
+              <w:t xml:space="preserve">Não aparece a opção de entrar</w:t>
             </w:r>
           </w:p>
         </w:tc>
@@ -11596,7 +11614,7 @@
                 <w:sz w:val="19"/>
                 <w:szCs w:val="19"/>
               </w:rPr>
-              <w:t xml:space="preserve">Backend fora do ar ou Client ID não configurado</w:t>
+              <w:t xml:space="preserve">Client ID ainda não configurado (estado atual)</w:t>
             </w:r>
           </w:p>
         </w:tc>
@@ -11628,7 +11646,108 @@
                 <w:sz w:val="19"/>
                 <w:szCs w:val="19"/>
               </w:rPr>
-              <w:t xml:space="preserve">O popup avisa; a extensão segue com as preferências locais. Configure conforme "Configuração do login"</w:t>
+              <w:t xml:space="preserve">Esperado: a extensão segue com as preferências locais. Para ativar, siga "Configuração do login"</w:t>
+            </w:r>
+          </w:p>
+        </w:tc>
+      </w:tr>
+      <w:tr>
+        <w:trPr>
+          <w:cantSplit/>
+        </w:trPr>
+        <w:tc>
+          <w:tcPr>
+            <w:tcW w:type="dxa" w:w="2891"/>
+            <w:tcBorders>
+              <w:top w:val="single" w:color="B8C7D1" w:sz="4"/>
+              <w:left w:val="single" w:color="B8C7D1" w:sz="4"/>
+              <w:bottom w:val="single" w:color="B8C7D1" w:sz="4"/>
+              <w:right w:val="single" w:color="B8C7D1" w:sz="4"/>
+            </w:tcBorders>
+            <w:tcMar>
+              <w:top w:type="dxa" w:w="70"/>
+              <w:left w:type="dxa" w:w="110"/>
+              <w:bottom w:type="dxa" w:w="70"/>
+              <w:right w:type="dxa" w:w="110"/>
+            </w:tcMar>
+          </w:tcPr>
+          <w:p>
+            <w:pPr>
+              <w:spacing w:line="264"/>
+            </w:pPr>
+            <w:r>
+              <w:rPr>
+                <w:rFonts w:ascii="Arial" w:cs="Arial" w:eastAsia="Arial" w:hAnsi="Arial"/>
+                <w:b w:val="false"/>
+                <w:bCs w:val="false"/>
+                <w:sz w:val="19"/>
+                <w:szCs w:val="19"/>
+              </w:rPr>
+              <w:t xml:space="preserve">Login não funciona (com Client ID)</w:t>
+            </w:r>
+          </w:p>
+        </w:tc>
+        <w:tc>
+          <w:tcPr>
+            <w:tcW w:type="dxa" w:w="2891"/>
+            <w:tcBorders>
+              <w:top w:val="single" w:color="B8C7D1" w:sz="4"/>
+              <w:left w:val="single" w:color="B8C7D1" w:sz="4"/>
+              <w:bottom w:val="single" w:color="B8C7D1" w:sz="4"/>
+              <w:right w:val="single" w:color="B8C7D1" w:sz="4"/>
+            </w:tcBorders>
+            <w:tcMar>
+              <w:top w:type="dxa" w:w="70"/>
+              <w:left w:type="dxa" w:w="110"/>
+              <w:bottom w:type="dxa" w:w="70"/>
+              <w:right w:type="dxa" w:w="110"/>
+            </w:tcMar>
+          </w:tcPr>
+          <w:p>
+            <w:pPr>
+              <w:spacing w:line="264"/>
+            </w:pPr>
+            <w:r>
+              <w:rPr>
+                <w:rFonts w:ascii="Arial" w:cs="Arial" w:eastAsia="Arial" w:hAnsi="Arial"/>
+                <w:b w:val="false"/>
+                <w:bCs w:val="false"/>
+                <w:sz w:val="19"/>
+                <w:szCs w:val="19"/>
+              </w:rPr>
+              <w:t xml:space="preserve">Backend fora do ar ou URL errada</w:t>
+            </w:r>
+          </w:p>
+        </w:tc>
+        <w:tc>
+          <w:tcPr>
+            <w:tcW w:type="dxa" w:w="3856"/>
+            <w:tcBorders>
+              <w:top w:val="single" w:color="B8C7D1" w:sz="4"/>
+              <w:left w:val="single" w:color="B8C7D1" w:sz="4"/>
+              <w:bottom w:val="single" w:color="B8C7D1" w:sz="4"/>
+              <w:right w:val="single" w:color="B8C7D1" w:sz="4"/>
+            </w:tcBorders>
+            <w:tcMar>
+              <w:top w:type="dxa" w:w="70"/>
+              <w:left w:type="dxa" w:w="110"/>
+              <w:bottom w:type="dxa" w:w="70"/>
+              <w:right w:type="dxa" w:w="110"/>
+            </w:tcMar>
+          </w:tcPr>
+          <w:p>
+            <w:pPr>
+              <w:spacing w:line="264"/>
+            </w:pPr>
+            <w:r>
+              <w:rPr>
+                <w:rFonts w:ascii="Arial" w:cs="Arial" w:eastAsia="Arial" w:hAnsi="Arial"/>
+                <w:b w:val="false"/>
+                <w:bCs w:val="false"/>
+                <w:sz w:val="19"/>
+                <w:szCs w:val="19"/>
+              </w:rPr>
+              <w:t xml:space="preserve">O popup avisa; a extensão segue com as preferências locais</w:t>
             </w:r>
           </w:p>
         </w:tc>
@@ -15019,6 +15138,86 @@
     </w:p>
     <w:p>
       <w:pPr>
+        <w:pBdr>
+          <w:left w:val="single" w:color="0B5E85" w:sz="24" w:space="8"/>
+        </w:pBdr>
+        <w:shd w:fill="EAF4FA" w:val="clear"/>
+        <w:spacing w:after="160" w:before="80" w:line="300"/>
+        <w:ind w:left="200"/>
+      </w:pPr>
+      <w:r>
+        <w:rPr>
+          <w:rFonts w:ascii="Arial" w:cs="Arial" w:eastAsia="Arial" w:hAnsi="Arial"/>
+          <w:b/>
+          <w:bCs/>
+          <w:sz w:val="22"/>
+          <w:szCs w:val="22"/>
+        </w:rPr>
+        <w:t xml:space="preserve">Situação em 30/10/2026:</w:t>
+      </w:r>
+      <w:r>
+        <w:rPr>
+          <w:rFonts w:ascii="Arial" w:cs="Arial" w:eastAsia="Arial" w:hAnsi="Arial"/>
+          <w:sz w:val="22"/>
+          <w:szCs w:val="22"/>
+        </w:rPr>
+        <w:t xml:space="preserve"> o login está implementado e testado com o Google simulado, mas </w:t>
+      </w:r>
+      <w:r>
+        <w:rPr>
+          <w:rFonts w:ascii="Arial" w:cs="Arial" w:eastAsia="Arial" w:hAnsi="Arial"/>
+          <w:b/>
+          <w:bCs/>
+          <w:sz w:val="22"/>
+          <w:szCs w:val="22"/>
+        </w:rPr>
+        <w:t xml:space="preserve">desativado</w:t>
+      </w:r>
+      <w:r>
+        <w:rPr>
+          <w:rFonts w:ascii="Arial" w:cs="Arial" w:eastAsia="Arial" w:hAnsi="Arial"/>
+          <w:sz w:val="22"/>
+          <w:szCs w:val="22"/>
+        </w:rPr>
+        <w:t xml:space="preserve">. Criar o cliente OAuth exige um projeto no Google Cloud, que pede uma forma de pagamento cadastrada, e a equipe não pôde fazê-lo. Enquanto </w:t>
+      </w:r>
+      <w:r>
+        <w:rPr>
+          <w:rFonts w:ascii="Consolas" w:cs="Consolas" w:eastAsia="Consolas" w:hAnsi="Consolas"/>
+          <w:sz w:val="22"/>
+          <w:szCs w:val="22"/>
+          <w:shd w:fill="EEF3F6" w:color="auto" w:val="clear"/>
+        </w:rPr>
+        <w:t xml:space="preserve">GOOGLE_CLIENT_ID</w:t>
+      </w:r>
+      <w:r>
+        <w:rPr>
+          <w:rFonts w:ascii="Arial" w:cs="Arial" w:eastAsia="Arial" w:hAnsi="Arial"/>
+          <w:sz w:val="22"/>
+          <w:szCs w:val="22"/>
+        </w:rPr>
+        <w:t xml:space="preserve"> estiver vazio em </w:t>
+      </w:r>
+      <w:r>
+        <w:rPr>
+          <w:rFonts w:ascii="Consolas" w:cs="Consolas" w:eastAsia="Consolas" w:hAnsi="Consolas"/>
+          <w:sz w:val="22"/>
+          <w:szCs w:val="22"/>
+          <w:shd w:fill="EEF3F6" w:color="auto" w:val="clear"/>
+        </w:rPr>
+        <w:t xml:space="preserve">src/shared/auth.js</w:t>
+      </w:r>
+      <w:r>
+        <w:rPr>
+          <w:rFonts w:ascii="Arial" w:cs="Arial" w:eastAsia="Arial" w:hAnsi="Arial"/>
+          <w:sz w:val="22"/>
+          <w:szCs w:val="22"/>
+        </w:rPr>
+        <w:t xml:space="preserve">, o cartão de conta não aparece no popup e a extensão usa só preferências locais. Alguém com conta no Google Cloud pode criar o projeto e entregar o Client ID.</w:t>
+      </w:r>
+    </w:p>
+    <w:p>
+      <w:pPr>
         <w:pStyle w:val="Heading3"/>
         <w:keepNext/>
         <w:spacing w:after="100" w:before="220"/>
@@ -15050,7 +15249,7 @@
           <w:sz w:val="22"/>
           <w:szCs w:val="22"/>
         </w:rPr>
-        <w:t xml:space="preserve">Criar o cliente OAuth no Google Cloud, preencher </w:t>
+        <w:t xml:space="preserve">Criar o cliente OAuth no Google Cloud (exige forma de pagamento), preencher </w:t>
       </w:r>
       <w:r>
         <w:rPr>
@@ -15364,7 +15563,7 @@
           <w:sz w:val="22"/>
           <w:szCs w:val="22"/>
         </w:rPr>
-        <w:t xml:space="preserve">Configurar o Google Cloud e testar o login real; publicar o backend com HTTPS.</w:t>
+        <w:t xml:space="preserve">Ativar o login: criar o cliente OAuth no Google Cloud (precisa de forma de pagamento), preencher o Client ID, testar com o Google real e publicar o backend com HTTPS.</w:t>
       </w:r>
     </w:p>
     <w:p>

</xml_diff>

<commit_message>
Registra a medição de contraste e o teste no Edge nos documentos
</commit_message>
<xml_diff>
--- a/docs/atualizados/HoverVoice-Documentacao-do-Software.docx
+++ b/docs/atualizados/HoverVoice-Documentacao-do-Software.docx
@@ -9735,15 +9735,15 @@
           <w:sz w:val="22"/>
           <w:szCs w:val="22"/>
         </w:rPr>
-        <w:t xml:space="preserve">Pendência de qualidade:</w:t>
-      </w:r>
-      <w:r>
-        <w:rPr>
-          <w:rFonts w:ascii="Arial" w:cs="Arial" w:eastAsia="Arial" w:hAnsi="Arial"/>
-          <w:sz w:val="22"/>
-          <w:szCs w:val="22"/>
-        </w:rPr>
-        <w:t xml:space="preserve"> o contraste de todas as cores deve ser medido para confirmar a relação mínima de 4,5:1 (WCAG 2.1 AA). O resultado fica no Documento de Qualidade.</w:t>
+        <w:t xml:space="preserve">Contraste:</w:t>
+      </w:r>
+      <w:r>
+        <w:rPr>
+          <w:rFonts w:ascii="Arial" w:cs="Arial" w:eastAsia="Arial" w:hAnsi="Arial"/>
+          <w:sz w:val="22"/>
+          <w:szCs w:val="22"/>
+        </w:rPr>
+        <w:t xml:space="preserve"> medido em 30/10/2026 (WCAG 2.1 AA). Todos os textos passam de 4,5:1; as bordas de campos, botões e segmentos e o interruptor desligado foram clareados para atingir 3:1. O detalhe está no Documento de Qualidade.</w:t>
       </w:r>
     </w:p>
     <w:p>
@@ -15582,24 +15582,6 @@
           <w:szCs w:val="22"/>
         </w:rPr>
         <w:t xml:space="preserve">Conferir os IDs de requisitos com o DOC-04.</w:t>
-      </w:r>
-    </w:p>
-    <w:p>
-      <w:pPr>
-        <w:pStyle w:val="ListParagraph"/>
-        <w:numPr>
-          <w:ilvl w:val="0"/>
-          <w:numId w:val="11"/>
-        </w:numPr>
-        <w:spacing w:after="60" w:line="288"/>
-      </w:pPr>
-      <w:r>
-        <w:rPr>
-          <w:rFonts w:ascii="Arial" w:cs="Arial" w:eastAsia="Arial" w:hAnsi="Arial"/>
-          <w:sz w:val="22"/>
-          <w:szCs w:val="22"/>
-        </w:rPr>
-        <w:t xml:space="preserve">Medir o contraste da interface e corrigir, se necessário.</w:t>
       </w:r>
     </w:p>
     <w:p>

</xml_diff>